<commit_message>
Restore Al-Shafei (2025) citation with full reference from original manuscript
https://claude.ai/code/session_01QDFx2XC9jsPrho9JCtviZB
</commit_message>
<xml_diff>
--- a/JRIM_submission_package/JRIM_formatted_manuscript_REVISED.docx
+++ b/JRIM_submission_package/JRIM_formatted_manuscript_REVISED.docx
@@ -282,7 +282,7 @@
     </w:p>
     <w:p>
       <w:r>
-        <w:t>This efficiency-centric view, however, rests on a narrow conception of service evaluation. Service research has long demonstrated that efficiency alone rarely guarantees satisfaction, particularly in interactions involving uncertainty, frustration, or emotional stakes (Wirtz et al., 2018; McColl-Kennedy et al., 2019). Efficient but dismissive service in human-delivered contexts reliably generates dissatisfaction, indicating that outcome quality cannot substitute for interactional quality (Bitner, 1990). The implicit assumption in AI service research is that users suspend such relational expectations when the service agent is artificial – an assumption that is increasingly contradicted by evidence. Studies report that users abandon chatbot interactions despite high efficiency when they perceive the system as unresponsive, rigid, or dismissive (Zhang et al., 2024). These failures are attributed not to slowness or inaccuracy but to interactional breakdowns in which the system appears unwilling to engage with user concerns beyond scripted responses.</w:t>
+        <w:t>This efficiency-centric view, however, rests on a narrow conception of service evaluation. Service research has long demonstrated that efficiency alone rarely guarantees satisfaction, particularly in interactions involving uncertainty, frustration, or emotional stakes (Wirtz et al., 2018; McColl-Kennedy et al., 2019). Efficient but dismissive service in human-delivered contexts reliably generates dissatisfaction, indicating that outcome quality cannot substitute for interactional quality (Bitner, 1990). The implicit assumption in AI service research is that users suspend such relational expectations when the service agent is artificial – an assumption that is increasingly contradicted by evidence. Studies report that users abandon chatbot interactions despite high efficiency when they perceive the system as unresponsive, rigid, or dismissive (Zhang et al., 2024; Al-Shafei, 2025). These failures are attributed not to slowness or inaccuracy but to interactional breakdowns in which the system appears unwilling to engage with user concerns beyond scripted responses.</w:t>
       </w:r>
     </w:p>
     <w:p>
@@ -969,6 +969,11 @@
       </w:pPr>
       <w:r>
         <w:t>References</w:t>
+      </w:r>
+    </w:p>
+    <w:p>
+      <w:r>
+        <w:t xml:space="preserve">Al-Shafei, M. (2025), "Navigating human-chatbot interactions: an investigation into factors influencing user satisfaction and engagement", International Journal of Human–Computer Interaction, Vol. 41 No. 1, pp. 411-428.</w:t>
       </w:r>
     </w:p>
     <w:p>

</xml_diff>